<commit_message>
docs: điền thông tin nhóm + phân công công việc vào Proposal & Báo cáo
- Proposal-WebNoiThat.docx: sinh từ file gốc 'Website ban do noi that.docx',
  điền vai trò 3 thành viên (Lương - nhóm trưởng/backend, Kiên - backend,
  Kiệt - frontend) + GVHD Phạm Hữu Tùng
- Điền đủ 26/26 dòng 'Phân công công việc' trong 5 bảng kế hoạch 10 tuần,
  sửa chữ sót template ('Room, Booking' -> 'Products, Orders, Cart')
- BaoCao-WebNoiThat.docx: thêm khối thông tin nhóm sau tiêu đề
- scripts/fill_proposal.py: script python-docx tự động hóa việc điền,
  tái tạo được khi file gốc thay đổi

Co-Authored-By: Claude <noreply@anthropic.com>
</commit_message>
<xml_diff>
--- a/docs/BaoCao-WebNoiThat.docx
+++ b/docs/BaoCao-WebNoiThat.docx
@@ -8,6 +8,31 @@
       </w:pPr>
       <w:r>
         <w:t>BÁO CÁO ĐỒ ÁN — Website Bán Đồ Nội Thất Trực Tuyến</w:t>
+      </w:r>
+    </w:p>
+    <w:p>
+      <w:r>
+        <w:t>Nhóm thực hiện (3 thành viên):</w:t>
+      </w:r>
+    </w:p>
+    <w:p>
+      <w:r>
+        <w:t>• Trần Đức Lương – 1502368 (Nhóm trưởng · Backend)</w:t>
+      </w:r>
+    </w:p>
+    <w:p>
+      <w:r>
+        <w:t>• Nguyễn Như Kiên – 0015768 (Backend)</w:t>
+      </w:r>
+    </w:p>
+    <w:p>
+      <w:r>
+        <w:t>• Phan Thế Kiệt – 0015968 (Frontend)</w:t>
+      </w:r>
+    </w:p>
+    <w:p>
+      <w:r>
+        <w:t>Giảng viên hướng dẫn: Phạm Hữu Tùng</w:t>
       </w:r>
     </w:p>
     <w:p>

</xml_diff>